<commit_message>
Fix native SSN demo fixtures and enable verified online scanner labeling
Use distinct contextual synthetic SSNs and multipage PDFs; preserve native confidence thresholds. Add scoped online enforcement, persisted-label verification, repeatable demo reset, and accurate Purview reporting guidance.

Co-authored-by: Copilot App <223556219+Copilot@users.noreply.github.com>
</commit_message>
<xml_diff>
--- a/demo/content/generated/pii-spo-1.docx
+++ b/demo/content/generated/pii-spo-1.docx
@@ -4,12 +4,12 @@
   <w:body>
     <w:p>
       <w:r>
-        <w:t xml:space="preserve">Synthetic identifier count demonstration. Repeated values are deliberate and do not represent unique people.</w:t>
+        <w:t xml:space="preserve">Synthetic identifier count demonstration. Invented values do not represent people.</w:t>
       </w:r>
     </w:p>
     <w:p>
       <w:r>
-        <w:t xml:space="preserve">123-45-6789</w:t>
+        <w:t xml:space="preserve">Synthetic Social Security Number SSN: 321-54-1000</w:t>
       </w:r>
     </w:p>
     <w:sectPr/>

</xml_diff>